<commit_message>
Entregables al dia, desde el commit 8fe1f1a del repositorio de trabajo
</commit_message>
<xml_diff>
--- a/ENTREGA NEGOCIO/PRIMER ENTREGA/Log de prompts - Negocio.docx
+++ b/ENTREGA NEGOCIO/PRIMER ENTREGA/Log de prompts - Negocio.docx
@@ -3732,6 +3732,35 @@
     </w:p>
     <w:p>
       <w:pPr>
+        <w:jc w:val="both"/>
+      </w:pPr>
+      <w:r>
+        <w:rPr>
+          <w:rFonts w:ascii="Calibri" w:hAnsi="Calibri" w:cs="Calibri"/>
+        </w:rPr>
+        <w:t>Los números de arriba son los del 7 de septiembre y quedan como estaban.</w:t>
+      </w:r>
+      <w:r>
+        <w:rPr>
+          <w:rFonts w:ascii="Calibri" w:hAnsi="Calibri" w:cs="Calibri"/>
+        </w:rPr>
+        <w:t xml:space="preserve"> Ese día el libro tenía diecisiete hojas y el recorte eran las nueve primeras. Después el libro sumó cuatro hojas —Impuestos, Métricas SaaS, Gráficos y Gráficos de la evaluación, el cambio D-35— y la de Gráficos entra en esta entrega. </w:t>
+      </w:r>
+      <w:r>
+        <w:rPr>
+          <w:rFonts w:ascii="Calibri" w:hAnsi="Calibri" w:cs="Calibri"/>
+        </w:rPr>
+        <w:t>Hoy son veintiuna hojas y se entregan diez; las que se quitan son once.</w:t>
+      </w:r>
+      <w:r>
+        <w:rPr>
+          <w:rFonts w:ascii="Calibri" w:hAnsi="Calibri" w:cs="Calibri"/>
+        </w:rPr>
+        <w:t xml:space="preserve"> El criterio no cambió, cambió el libro: quien abra el Excel entregado cuenta diez pestañas y ésa es la cuenta buena.</w:t>
+      </w:r>
+    </w:p>
+    <w:p>
+      <w:pPr>
         <w:pStyle w:val="Ttulo2"/>
         <w:jc w:val="both"/>
       </w:pPr>
@@ -14311,7 +14340,7 @@
         </w:trPr>
         <w:tc>
           <w:tcPr>
-            <w:tcW w:type="dxa" w:w="747"/>
+            <w:tcW w:type="dxa" w:w="734"/>
             <w:vAlign w:val="center"/>
             <w:tcMar>
               <w:top w:w="100" w:type="dxa"/>
@@ -14341,7 +14370,7 @@
         </w:tc>
         <w:tc>
           <w:tcPr>
-            <w:tcW w:type="dxa" w:w="1293"/>
+            <w:tcW w:type="dxa" w:w="1268"/>
             <w:vAlign w:val="center"/>
             <w:tcMar>
               <w:top w:w="100" w:type="dxa"/>
@@ -14371,7 +14400,7 @@
         </w:tc>
         <w:tc>
           <w:tcPr>
-            <w:tcW w:type="dxa" w:w="1508"/>
+            <w:tcW w:type="dxa" w:w="2062"/>
             <w:vAlign w:val="center"/>
             <w:tcMar>
               <w:top w:w="100" w:type="dxa"/>
@@ -14401,7 +14430,7 @@
         </w:tc>
         <w:tc>
           <w:tcPr>
-            <w:tcW w:type="dxa" w:w="2592"/>
+            <w:tcW w:type="dxa" w:w="1966"/>
             <w:vAlign w:val="center"/>
             <w:tcMar>
               <w:top w:w="100" w:type="dxa"/>
@@ -14431,7 +14460,7 @@
         </w:tc>
         <w:tc>
           <w:tcPr>
-            <w:tcW w:type="dxa" w:w="2364"/>
+            <w:tcW w:type="dxa" w:w="2474"/>
             <w:vAlign w:val="center"/>
             <w:tcMar>
               <w:top w:w="100" w:type="dxa"/>
@@ -14463,7 +14492,7 @@
       <w:tr>
         <w:tc>
           <w:tcPr>
-            <w:tcW w:type="dxa" w:w="747"/>
+            <w:tcW w:type="dxa" w:w="734"/>
             <w:vAlign w:val="center"/>
             <w:tcMar>
               <w:top w:w="100" w:type="dxa"/>
@@ -14488,7 +14517,7 @@
         </w:tc>
         <w:tc>
           <w:tcPr>
-            <w:tcW w:type="dxa" w:w="1293"/>
+            <w:tcW w:type="dxa" w:w="1268"/>
             <w:vAlign w:val="center"/>
             <w:tcMar>
               <w:top w:w="100" w:type="dxa"/>
@@ -14513,7 +14542,7 @@
         </w:tc>
         <w:tc>
           <w:tcPr>
-            <w:tcW w:type="dxa" w:w="1508"/>
+            <w:tcW w:type="dxa" w:w="2062"/>
             <w:vAlign w:val="center"/>
             <w:tcMar>
               <w:top w:w="100" w:type="dxa"/>
@@ -14538,7 +14567,7 @@
         </w:tc>
         <w:tc>
           <w:tcPr>
-            <w:tcW w:type="dxa" w:w="2592"/>
+            <w:tcW w:type="dxa" w:w="1966"/>
             <w:vAlign w:val="center"/>
             <w:tcMar>
               <w:top w:w="100" w:type="dxa"/>
@@ -14563,7 +14592,7 @@
         </w:tc>
         <w:tc>
           <w:tcPr>
-            <w:tcW w:type="dxa" w:w="2364"/>
+            <w:tcW w:type="dxa" w:w="2474"/>
             <w:vAlign w:val="center"/>
             <w:tcMar>
               <w:top w:w="100" w:type="dxa"/>
@@ -14590,7 +14619,7 @@
       <w:tr>
         <w:tc>
           <w:tcPr>
-            <w:tcW w:type="dxa" w:w="747"/>
+            <w:tcW w:type="dxa" w:w="734"/>
             <w:vAlign w:val="center"/>
             <w:tcMar>
               <w:top w:w="100" w:type="dxa"/>
@@ -14615,7 +14644,7 @@
         </w:tc>
         <w:tc>
           <w:tcPr>
-            <w:tcW w:type="dxa" w:w="1293"/>
+            <w:tcW w:type="dxa" w:w="1268"/>
             <w:vAlign w:val="center"/>
             <w:tcMar>
               <w:top w:w="100" w:type="dxa"/>
@@ -14640,7 +14669,7 @@
         </w:tc>
         <w:tc>
           <w:tcPr>
-            <w:tcW w:type="dxa" w:w="1508"/>
+            <w:tcW w:type="dxa" w:w="2062"/>
             <w:vAlign w:val="center"/>
             <w:tcMar>
               <w:top w:w="100" w:type="dxa"/>
@@ -14665,7 +14694,7 @@
         </w:tc>
         <w:tc>
           <w:tcPr>
-            <w:tcW w:type="dxa" w:w="2592"/>
+            <w:tcW w:type="dxa" w:w="1966"/>
             <w:vAlign w:val="center"/>
             <w:tcMar>
               <w:top w:w="100" w:type="dxa"/>
@@ -14690,7 +14719,7 @@
         </w:tc>
         <w:tc>
           <w:tcPr>
-            <w:tcW w:type="dxa" w:w="2364"/>
+            <w:tcW w:type="dxa" w:w="2474"/>
             <w:vAlign w:val="center"/>
             <w:tcMar>
               <w:top w:w="100" w:type="dxa"/>
@@ -14717,7 +14746,7 @@
       <w:tr>
         <w:tc>
           <w:tcPr>
-            <w:tcW w:type="dxa" w:w="747"/>
+            <w:tcW w:type="dxa" w:w="734"/>
             <w:vAlign w:val="center"/>
             <w:tcMar>
               <w:top w:w="100" w:type="dxa"/>
@@ -14742,7 +14771,7 @@
         </w:tc>
         <w:tc>
           <w:tcPr>
-            <w:tcW w:type="dxa" w:w="1293"/>
+            <w:tcW w:type="dxa" w:w="1268"/>
             <w:vAlign w:val="center"/>
             <w:tcMar>
               <w:top w:w="100" w:type="dxa"/>
@@ -14767,7 +14796,7 @@
         </w:tc>
         <w:tc>
           <w:tcPr>
-            <w:tcW w:type="dxa" w:w="1508"/>
+            <w:tcW w:type="dxa" w:w="2062"/>
             <w:vAlign w:val="center"/>
             <w:tcMar>
               <w:top w:w="100" w:type="dxa"/>
@@ -14792,7 +14821,7 @@
         </w:tc>
         <w:tc>
           <w:tcPr>
-            <w:tcW w:type="dxa" w:w="2592"/>
+            <w:tcW w:type="dxa" w:w="1966"/>
             <w:vAlign w:val="center"/>
             <w:tcMar>
               <w:top w:w="100" w:type="dxa"/>
@@ -14817,7 +14846,7 @@
         </w:tc>
         <w:tc>
           <w:tcPr>
-            <w:tcW w:type="dxa" w:w="2364"/>
+            <w:tcW w:type="dxa" w:w="2474"/>
             <w:vAlign w:val="center"/>
             <w:tcMar>
               <w:top w:w="100" w:type="dxa"/>
@@ -14844,7 +14873,7 @@
       <w:tr>
         <w:tc>
           <w:tcPr>
-            <w:tcW w:type="dxa" w:w="747"/>
+            <w:tcW w:type="dxa" w:w="734"/>
             <w:vAlign w:val="center"/>
             <w:tcMar>
               <w:top w:w="100" w:type="dxa"/>
@@ -14869,7 +14898,7 @@
         </w:tc>
         <w:tc>
           <w:tcPr>
-            <w:tcW w:type="dxa" w:w="1293"/>
+            <w:tcW w:type="dxa" w:w="1268"/>
             <w:vAlign w:val="center"/>
             <w:tcMar>
               <w:top w:w="100" w:type="dxa"/>
@@ -14894,7 +14923,7 @@
         </w:tc>
         <w:tc>
           <w:tcPr>
-            <w:tcW w:type="dxa" w:w="1508"/>
+            <w:tcW w:type="dxa" w:w="2062"/>
             <w:vAlign w:val="center"/>
             <w:tcMar>
               <w:top w:w="100" w:type="dxa"/>
@@ -14919,7 +14948,7 @@
         </w:tc>
         <w:tc>
           <w:tcPr>
-            <w:tcW w:type="dxa" w:w="2592"/>
+            <w:tcW w:type="dxa" w:w="1966"/>
             <w:vAlign w:val="center"/>
             <w:tcMar>
               <w:top w:w="100" w:type="dxa"/>
@@ -14944,7 +14973,7 @@
         </w:tc>
         <w:tc>
           <w:tcPr>
-            <w:tcW w:type="dxa" w:w="2364"/>
+            <w:tcW w:type="dxa" w:w="2474"/>
             <w:vAlign w:val="center"/>
             <w:tcMar>
               <w:top w:w="100" w:type="dxa"/>
@@ -14964,6 +14993,577 @@
                 <w:sz w:val="20"/>
               </w:rPr>
               <w:t>La meta de equipos del mes 12 estaba en 1.000 en la tabla de 5.2.3 y en 450 en la prosa de tres secciones, y el cuadro comparativo declaraba mi precio como «a definir»: el cambio D-76</w:t>
+            </w:r>
+          </w:p>
+        </w:tc>
+      </w:tr>
+      <w:tr>
+        <w:tc>
+          <w:tcPr>
+            <w:tcW w:type="dxa" w:w="734"/>
+            <w:vAlign w:val="center"/>
+            <w:tcMar>
+              <w:top w:w="100" w:type="dxa"/>
+              <w:left w:w="100" w:type="dxa"/>
+              <w:bottom w:w="100" w:type="dxa"/>
+              <w:right w:w="100" w:type="dxa"/>
+            </w:tcMar>
+          </w:tcPr>
+          <w:p>
+            <w:pPr>
+              <w:spacing w:after="0" w:line="240" w:lineRule="auto"/>
+              <w:jc w:val="left"/>
+            </w:pPr>
+            <w:r>
+              <w:rPr>
+                <w:rFonts w:ascii="Calibri" w:hAnsi="Calibri" w:cs="Calibri"/>
+                <w:sz w:val="20"/>
+              </w:rPr>
+              <w:t>21:30</w:t>
+            </w:r>
+          </w:p>
+        </w:tc>
+        <w:tc>
+          <w:tcPr>
+            <w:tcW w:type="dxa" w:w="1268"/>
+            <w:vAlign w:val="center"/>
+            <w:tcMar>
+              <w:top w:w="100" w:type="dxa"/>
+              <w:left w:w="100" w:type="dxa"/>
+              <w:bottom w:w="100" w:type="dxa"/>
+              <w:right w:w="100" w:type="dxa"/>
+            </w:tcMar>
+          </w:tcPr>
+          <w:p>
+            <w:pPr>
+              <w:spacing w:after="0" w:line="240" w:lineRule="auto"/>
+              <w:jc w:val="left"/>
+            </w:pPr>
+            <w:r>
+              <w:rPr>
+                <w:rFonts w:ascii="Calibri" w:hAnsi="Calibri" w:cs="Calibri"/>
+                <w:sz w:val="20"/>
+              </w:rPr>
+              <w:t>Hallazgo</w:t>
+            </w:r>
+          </w:p>
+        </w:tc>
+        <w:tc>
+          <w:tcPr>
+            <w:tcW w:type="dxa" w:w="2062"/>
+            <w:vAlign w:val="center"/>
+            <w:tcMar>
+              <w:top w:w="100" w:type="dxa"/>
+              <w:left w:w="100" w:type="dxa"/>
+              <w:bottom w:w="100" w:type="dxa"/>
+              <w:right w:w="100" w:type="dxa"/>
+            </w:tcMar>
+          </w:tcPr>
+          <w:p>
+            <w:pPr>
+              <w:spacing w:after="0" w:line="240" w:lineRule="auto"/>
+              <w:jc w:val="left"/>
+            </w:pPr>
+            <w:r>
+              <w:rPr>
+                <w:rFonts w:ascii="Calibri" w:hAnsi="Calibri" w:cs="Calibri"/>
+                <w:sz w:val="20"/>
+              </w:rPr>
+              <w:t>Antes de entregar, auditá la carpeta de negocio entera contra sus fuentes: no si las decisiones son buenas, sino si lo que el paquete afirma sobre sí mismo se sostiene</w:t>
+            </w:r>
+          </w:p>
+        </w:tc>
+        <w:tc>
+          <w:tcPr>
+            <w:tcW w:type="dxa" w:w="1966"/>
+            <w:vAlign w:val="center"/>
+            <w:tcMar>
+              <w:top w:w="100" w:type="dxa"/>
+              <w:left w:w="100" w:type="dxa"/>
+              <w:bottom w:w="100" w:type="dxa"/>
+              <w:right w:w="100" w:type="dxa"/>
+            </w:tcMar>
+          </w:tcPr>
+          <w:p>
+            <w:pPr>
+              <w:spacing w:after="0" w:line="240" w:lineRule="auto"/>
+              <w:jc w:val="left"/>
+            </w:pPr>
+            <w:r>
+              <w:rPr>
+                <w:rFonts w:ascii="Calibri" w:hAnsi="Calibri" w:cs="Calibri"/>
+                <w:sz w:val="20"/>
+              </w:rPr>
+              <w:t>Es la misma lupa que se pasó por el documento, aplicada al paquete. Los veintidós controles automáticos comparan lo que se puede comparar solo; lo que dice la prosa sobre el propio paquete no lo mira nadie</w:t>
+            </w:r>
+          </w:p>
+        </w:tc>
+        <w:tc>
+          <w:tcPr>
+            <w:tcW w:type="dxa" w:w="2474"/>
+            <w:vAlign w:val="center"/>
+            <w:tcMar>
+              <w:top w:w="100" w:type="dxa"/>
+              <w:left w:w="100" w:type="dxa"/>
+              <w:bottom w:w="100" w:type="dxa"/>
+              <w:right w:w="100" w:type="dxa"/>
+            </w:tcMar>
+          </w:tcPr>
+          <w:p>
+            <w:pPr>
+              <w:spacing w:after="0" w:line="240" w:lineRule="auto"/>
+              <w:jc w:val="left"/>
+            </w:pPr>
+            <w:r>
+              <w:rPr>
+                <w:rFonts w:ascii="Calibri" w:hAnsi="Calibri" w:cs="Calibri"/>
+                <w:sz w:val="20"/>
+              </w:rPr>
+              <w:t>Cuatro contradicciones, ninguna de números: el modelo recalculó sin una sola celda de error y sus valores coinciden con el documento entregado</w:t>
+            </w:r>
+          </w:p>
+        </w:tc>
+      </w:tr>
+      <w:tr>
+        <w:tc>
+          <w:tcPr>
+            <w:tcW w:type="dxa" w:w="734"/>
+            <w:vAlign w:val="center"/>
+            <w:tcMar>
+              <w:top w:w="100" w:type="dxa"/>
+              <w:left w:w="100" w:type="dxa"/>
+              <w:bottom w:w="100" w:type="dxa"/>
+              <w:right w:w="100" w:type="dxa"/>
+            </w:tcMar>
+          </w:tcPr>
+          <w:p>
+            <w:pPr>
+              <w:spacing w:after="0" w:line="240" w:lineRule="auto"/>
+              <w:jc w:val="left"/>
+            </w:pPr>
+            <w:r>
+              <w:rPr>
+                <w:rFonts w:ascii="Calibri" w:hAnsi="Calibri" w:cs="Calibri"/>
+                <w:sz w:val="20"/>
+              </w:rPr>
+              <w:t>21:45</w:t>
+            </w:r>
+          </w:p>
+        </w:tc>
+        <w:tc>
+          <w:tcPr>
+            <w:tcW w:type="dxa" w:w="1268"/>
+            <w:vAlign w:val="center"/>
+            <w:tcMar>
+              <w:top w:w="100" w:type="dxa"/>
+              <w:left w:w="100" w:type="dxa"/>
+              <w:bottom w:w="100" w:type="dxa"/>
+              <w:right w:w="100" w:type="dxa"/>
+            </w:tcMar>
+          </w:tcPr>
+          <w:p>
+            <w:pPr>
+              <w:spacing w:after="0" w:line="240" w:lineRule="auto"/>
+              <w:jc w:val="left"/>
+            </w:pPr>
+            <w:r>
+              <w:rPr>
+                <w:rFonts w:ascii="Calibri" w:hAnsi="Calibri" w:cs="Calibri"/>
+                <w:sz w:val="20"/>
+              </w:rPr>
+              <w:t>Corrección</w:t>
+            </w:r>
+          </w:p>
+        </w:tc>
+        <w:tc>
+          <w:tcPr>
+            <w:tcW w:type="dxa" w:w="2062"/>
+            <w:vAlign w:val="center"/>
+            <w:tcMar>
+              <w:top w:w="100" w:type="dxa"/>
+              <w:left w:w="100" w:type="dxa"/>
+              <w:bottom w:w="100" w:type="dxa"/>
+              <w:right w:w="100" w:type="dxa"/>
+            </w:tcMar>
+          </w:tcPr>
+          <w:p>
+            <w:pPr>
+              <w:spacing w:after="0" w:line="240" w:lineRule="auto"/>
+              <w:jc w:val="left"/>
+            </w:pPr>
+            <w:r>
+              <w:rPr>
+                <w:rFonts w:ascii="Calibri" w:hAnsi="Calibri" w:cs="Calibri"/>
+                <w:sz w:val="20"/>
+              </w:rPr>
+              <w:t xml:space="preserve">El PN-10 del log dice en presente que el libro tiene diecisiete hojas y que se entregan las nueve primeras. Hoy son veintiuna y diez. </w:t>
+            </w:r>
+            <w:r>
+              <w:rPr>
+                <w:rFonts w:ascii="Calibri" w:hAnsi="Calibri" w:cs="Calibri"/>
+                <w:sz w:val="20"/>
+              </w:rPr>
+              <w:t>No cambies los números: agregá la aclaración</w:t>
+            </w:r>
+          </w:p>
+        </w:tc>
+        <w:tc>
+          <w:tcPr>
+            <w:tcW w:type="dxa" w:w="1966"/>
+            <w:vAlign w:val="center"/>
+            <w:tcMar>
+              <w:top w:w="100" w:type="dxa"/>
+              <w:left w:w="100" w:type="dxa"/>
+              <w:bottom w:w="100" w:type="dxa"/>
+              <w:right w:w="100" w:type="dxa"/>
+            </w:tcMar>
+          </w:tcPr>
+          <w:p>
+            <w:pPr>
+              <w:spacing w:after="0" w:line="240" w:lineRule="auto"/>
+              <w:jc w:val="left"/>
+            </w:pPr>
+            <w:r>
+              <w:rPr>
+                <w:rFonts w:ascii="Calibri" w:hAnsi="Calibri" w:cs="Calibri"/>
+                <w:sz w:val="20"/>
+              </w:rPr>
+              <w:t>Esa consulta fue del 7 de septiembre y ese día el libro tenía diecisiete hojas: el número era correcto. Reescribirlo para que cuadre es falsear el registro, y el log es un documento de integridad académica. Lo que cambió es el libro —D-35 le sumó cuatro hojas—, no el criterio</w:t>
+            </w:r>
+          </w:p>
+        </w:tc>
+        <w:tc>
+          <w:tcPr>
+            <w:tcW w:type="dxa" w:w="2474"/>
+            <w:vAlign w:val="center"/>
+            <w:tcMar>
+              <w:top w:w="100" w:type="dxa"/>
+              <w:left w:w="100" w:type="dxa"/>
+              <w:bottom w:w="100" w:type="dxa"/>
+              <w:right w:w="100" w:type="dxa"/>
+            </w:tcMar>
+          </w:tcPr>
+          <w:p>
+            <w:pPr>
+              <w:spacing w:after="0" w:line="240" w:lineRule="auto"/>
+              <w:jc w:val="left"/>
+            </w:pPr>
+            <w:r>
+              <w:rPr>
+                <w:rFonts w:ascii="Calibri" w:hAnsi="Calibri" w:cs="Calibri"/>
+                <w:sz w:val="20"/>
+              </w:rPr>
+              <w:t>El PN-10 conserva sus números con la fecha, y debajo dice cuántas hojas hay hoy. Quien abra el Excel cuenta diez pestañas y el log le explica por qué el texto de arriba dice nueve</w:t>
+            </w:r>
+          </w:p>
+        </w:tc>
+      </w:tr>
+      <w:tr>
+        <w:tc>
+          <w:tcPr>
+            <w:tcW w:type="dxa" w:w="734"/>
+            <w:vAlign w:val="center"/>
+            <w:tcMar>
+              <w:top w:w="100" w:type="dxa"/>
+              <w:left w:w="100" w:type="dxa"/>
+              <w:bottom w:w="100" w:type="dxa"/>
+              <w:right w:w="100" w:type="dxa"/>
+            </w:tcMar>
+          </w:tcPr>
+          <w:p>
+            <w:pPr>
+              <w:spacing w:after="0" w:line="240" w:lineRule="auto"/>
+              <w:jc w:val="left"/>
+            </w:pPr>
+            <w:r>
+              <w:rPr>
+                <w:rFonts w:ascii="Calibri" w:hAnsi="Calibri" w:cs="Calibri"/>
+                <w:sz w:val="20"/>
+              </w:rPr>
+              <w:t>21:55</w:t>
+            </w:r>
+          </w:p>
+        </w:tc>
+        <w:tc>
+          <w:tcPr>
+            <w:tcW w:type="dxa" w:w="1268"/>
+            <w:vAlign w:val="center"/>
+            <w:tcMar>
+              <w:top w:w="100" w:type="dxa"/>
+              <w:left w:w="100" w:type="dxa"/>
+              <w:bottom w:w="100" w:type="dxa"/>
+              <w:right w:w="100" w:type="dxa"/>
+            </w:tcMar>
+          </w:tcPr>
+          <w:p>
+            <w:pPr>
+              <w:spacing w:after="0" w:line="240" w:lineRule="auto"/>
+              <w:jc w:val="left"/>
+            </w:pPr>
+            <w:r>
+              <w:rPr>
+                <w:rFonts w:ascii="Calibri" w:hAnsi="Calibri" w:cs="Calibri"/>
+                <w:sz w:val="20"/>
+              </w:rPr>
+              <w:t>Corrección</w:t>
+            </w:r>
+          </w:p>
+        </w:tc>
+        <w:tc>
+          <w:tcPr>
+            <w:tcW w:type="dxa" w:w="2062"/>
+            <w:vAlign w:val="center"/>
+            <w:tcMar>
+              <w:top w:w="100" w:type="dxa"/>
+              <w:left w:w="100" w:type="dxa"/>
+              <w:bottom w:w="100" w:type="dxa"/>
+              <w:right w:w="100" w:type="dxa"/>
+            </w:tcMar>
+          </w:tcPr>
+          <w:p>
+            <w:pPr>
+              <w:spacing w:after="0" w:line="240" w:lineRule="auto"/>
+              <w:jc w:val="left"/>
+            </w:pPr>
+            <w:r>
+              <w:rPr>
+                <w:rFonts w:ascii="Calibri" w:hAnsi="Calibri" w:cs="Calibri"/>
+                <w:sz w:val="20"/>
+              </w:rPr>
+              <w:t>El LEEME de la entrega dice «Cuatro archivos» arriba y «Los tres salen con el formato» veinte líneas más abajo; y el README de negocio todavía plantea la meta de 1.000 equipos como decisión abierta con tres salidas</w:t>
+            </w:r>
+          </w:p>
+        </w:tc>
+        <w:tc>
+          <w:tcPr>
+            <w:tcW w:type="dxa" w:w="1966"/>
+            <w:vAlign w:val="center"/>
+            <w:tcMar>
+              <w:top w:w="100" w:type="dxa"/>
+              <w:left w:w="100" w:type="dxa"/>
+              <w:bottom w:w="100" w:type="dxa"/>
+              <w:right w:w="100" w:type="dxa"/>
+            </w:tcMar>
+          </w:tcPr>
+          <w:p>
+            <w:pPr>
+              <w:spacing w:after="0" w:line="240" w:lineRule="auto"/>
+              <w:jc w:val="left"/>
+            </w:pPr>
+            <w:r>
+              <w:rPr>
+                <w:rFonts w:ascii="Calibri" w:hAnsi="Calibri" w:cs="Calibri"/>
+                <w:sz w:val="20"/>
+              </w:rPr>
+              <w:t>Las dos son restos de una corrección que llegó hasta el entregable y no hasta su alrededor. La meta se resolvió en 450 y el control da 461, pero el README seguía contando el problema sin el final</w:t>
+            </w:r>
+          </w:p>
+        </w:tc>
+        <w:tc>
+          <w:tcPr>
+            <w:tcW w:type="dxa" w:w="2474"/>
+            <w:vAlign w:val="center"/>
+            <w:tcMar>
+              <w:top w:w="100" w:type="dxa"/>
+              <w:left w:w="100" w:type="dxa"/>
+              <w:bottom w:w="100" w:type="dxa"/>
+              <w:right w:w="100" w:type="dxa"/>
+            </w:tcMar>
+          </w:tcPr>
+          <w:p>
+            <w:pPr>
+              <w:spacing w:after="0" w:line="240" w:lineRule="auto"/>
+              <w:jc w:val="left"/>
+            </w:pPr>
+            <w:r>
+              <w:rPr>
+                <w:rFonts w:ascii="Calibri" w:hAnsi="Calibri" w:cs="Calibri"/>
+                <w:sz w:val="20"/>
+              </w:rPr>
+              <w:t>La fuente del LEEME dice «Los cuatro», y la sección del README pasa a contar cómo se resolvió, con los valores de la última recalculación: 22,8 clientes contra la meta de 25 y 461 equipos contra 450</w:t>
+            </w:r>
+          </w:p>
+        </w:tc>
+      </w:tr>
+      <w:tr>
+        <w:tc>
+          <w:tcPr>
+            <w:tcW w:type="dxa" w:w="734"/>
+            <w:vAlign w:val="center"/>
+            <w:tcMar>
+              <w:top w:w="100" w:type="dxa"/>
+              <w:left w:w="100" w:type="dxa"/>
+              <w:bottom w:w="100" w:type="dxa"/>
+              <w:right w:w="100" w:type="dxa"/>
+            </w:tcMar>
+          </w:tcPr>
+          <w:p>
+            <w:pPr>
+              <w:spacing w:after="0" w:line="240" w:lineRule="auto"/>
+              <w:jc w:val="left"/>
+            </w:pPr>
+            <w:r>
+              <w:rPr>
+                <w:rFonts w:ascii="Calibri" w:hAnsi="Calibri" w:cs="Calibri"/>
+                <w:sz w:val="20"/>
+              </w:rPr>
+              <w:t>22:10</w:t>
+            </w:r>
+          </w:p>
+        </w:tc>
+        <w:tc>
+          <w:tcPr>
+            <w:tcW w:type="dxa" w:w="1268"/>
+            <w:vAlign w:val="center"/>
+            <w:tcMar>
+              <w:top w:w="100" w:type="dxa"/>
+              <w:left w:w="100" w:type="dxa"/>
+              <w:bottom w:w="100" w:type="dxa"/>
+              <w:right w:w="100" w:type="dxa"/>
+            </w:tcMar>
+          </w:tcPr>
+          <w:p>
+            <w:pPr>
+              <w:spacing w:after="0" w:line="240" w:lineRule="auto"/>
+              <w:jc w:val="left"/>
+            </w:pPr>
+            <w:r>
+              <w:rPr>
+                <w:rFonts w:ascii="Calibri" w:hAnsi="Calibri" w:cs="Calibri"/>
+                <w:sz w:val="20"/>
+              </w:rPr>
+              <w:t>Hallazgo</w:t>
+            </w:r>
+          </w:p>
+        </w:tc>
+        <w:tc>
+          <w:tcPr>
+            <w:tcW w:type="dxa" w:w="2062"/>
+            <w:vAlign w:val="center"/>
+            <w:tcMar>
+              <w:top w:w="100" w:type="dxa"/>
+              <w:left w:w="100" w:type="dxa"/>
+              <w:bottom w:w="100" w:type="dxa"/>
+              <w:right w:w="100" w:type="dxa"/>
+            </w:tcMar>
+          </w:tcPr>
+          <w:p>
+            <w:pPr>
+              <w:spacing w:after="0" w:line="240" w:lineRule="auto"/>
+              <w:jc w:val="left"/>
+            </w:pPr>
+            <w:r>
+              <w:rPr>
+                <w:rFonts w:ascii="Calibri" w:hAnsi="Calibri" w:cs="Calibri"/>
+                <w:sz w:val="20"/>
+              </w:rPr>
+              <w:t xml:space="preserve">Comprobá vos mismo la receta de verificación que </w:t>
+            </w:r>
+            <w:r>
+              <w:rPr>
+                <w:rFonts w:ascii="Consolas" w:hAnsi="Consolas"/>
+                <w:sz w:val="18"/>
+              </w:rPr>
+              <w:t>VERSIONES.md</w:t>
+            </w:r>
+            <w:r>
+              <w:rPr>
+                <w:rFonts w:ascii="Calibri" w:hAnsi="Calibri" w:cs="Calibri"/>
+                <w:sz w:val="20"/>
+              </w:rPr>
+              <w:t xml:space="preserve"> le da al lector, en un clon nuevo</w:t>
+            </w:r>
+          </w:p>
+        </w:tc>
+        <w:tc>
+          <w:tcPr>
+            <w:tcW w:type="dxa" w:w="1966"/>
+            <w:vAlign w:val="center"/>
+            <w:tcMar>
+              <w:top w:w="100" w:type="dxa"/>
+              <w:left w:w="100" w:type="dxa"/>
+              <w:bottom w:w="100" w:type="dxa"/>
+              <w:right w:w="100" w:type="dxa"/>
+            </w:tcMar>
+          </w:tcPr>
+          <w:p>
+            <w:pPr>
+              <w:spacing w:after="0" w:line="240" w:lineRule="auto"/>
+              <w:jc w:val="left"/>
+            </w:pPr>
+            <w:r>
+              <w:rPr>
+                <w:rFonts w:ascii="Calibri" w:hAnsi="Calibri" w:cs="Calibri"/>
+                <w:sz w:val="20"/>
+              </w:rPr>
+              <w:t>Un manifiesto de hashes que no se prueba es peor que no tenerlo: da confianza sin darla. Y el lector va a correrlo en Windows, no acá</w:t>
+            </w:r>
+          </w:p>
+        </w:tc>
+        <w:tc>
+          <w:tcPr>
+            <w:tcW w:type="dxa" w:w="2474"/>
+            <w:vAlign w:val="center"/>
+            <w:tcMar>
+              <w:top w:w="100" w:type="dxa"/>
+              <w:left w:w="100" w:type="dxa"/>
+              <w:bottom w:w="100" w:type="dxa"/>
+              <w:right w:w="100" w:type="dxa"/>
+            </w:tcMar>
+          </w:tcPr>
+          <w:p>
+            <w:pPr>
+              <w:spacing w:after="0" w:line="240" w:lineRule="auto"/>
+              <w:jc w:val="left"/>
+            </w:pPr>
+            <w:r>
+              <w:rPr>
+                <w:rFonts w:ascii="Calibri" w:hAnsi="Calibri" w:cs="Calibri"/>
+                <w:sz w:val="20"/>
+              </w:rPr>
+              <w:t xml:space="preserve">Fallaba en los seis archivos de texto y acertaba en los cincuenta y un binarios. La causa es </w:t>
+            </w:r>
+            <w:r>
+              <w:rPr>
+                <w:rFonts w:ascii="Consolas" w:hAnsi="Consolas"/>
+                <w:sz w:val="18"/>
+              </w:rPr>
+              <w:t>core.autocrlf</w:t>
+            </w:r>
+            <w:r>
+              <w:rPr>
+                <w:rFonts w:ascii="Calibri" w:hAnsi="Calibri" w:cs="Calibri"/>
+                <w:sz w:val="20"/>
+              </w:rPr>
+              <w:t xml:space="preserve">: git guarda LF y devuelve CRLF al clonar, así que el hash declarado no sobrevive al clon. Se resuelve con un </w:t>
+            </w:r>
+            <w:r>
+              <w:rPr>
+                <w:rFonts w:ascii="Consolas" w:hAnsi="Consolas"/>
+                <w:sz w:val="18"/>
+              </w:rPr>
+              <w:t>.gitattributes</w:t>
+            </w:r>
+            <w:r>
+              <w:rPr>
+                <w:rFonts w:ascii="Calibri" w:hAnsi="Calibri" w:cs="Calibri"/>
+                <w:sz w:val="20"/>
+              </w:rPr>
+              <w:t xml:space="preserve"> con </w:t>
+            </w:r>
+            <w:r>
+              <w:rPr>
+                <w:rFonts w:ascii="Consolas" w:hAnsi="Consolas"/>
+                <w:sz w:val="18"/>
+              </w:rPr>
+              <w:t>* -text</w:t>
+            </w:r>
+            <w:r>
+              <w:rPr>
+                <w:rFonts w:ascii="Calibri" w:hAnsi="Calibri" w:cs="Calibri"/>
+                <w:sz w:val="20"/>
+              </w:rPr>
+              <w:t xml:space="preserve"> en los repositorios de publicación, y queda escrito en el propio manifiesto</w:t>
             </w:r>
           </w:p>
         </w:tc>
@@ -14972,6 +15572,8 @@
     <w:sectPr>
       <w:headerReference w:type="default" r:id="rId70"/>
       <w:footerReference w:type="default" r:id="rId71"/>
+      <w:headerReference w:type="first" r:id="rId166"/>
+      <w:headerReference w:type="even" r:id="rId167"/>
       <w:pgSz w:w="12240" w:h="15840"/>
       <w:pgMar w:top="1440" w:right="1440" w:bottom="1440" w:left="1440" w:header="708" w:footer="708" w:gutter="0"/>
       <w:cols w:space="708"/>
@@ -15382,7 +15984,7 @@
               <w:sz w:val="22"/>
               <w:szCs w:val="22"/>
             </w:rPr>
-            <w:t>13</w:t>
+            <w:t>18/09/2026</w:t>
           </w:r>
           <w:r>
             <w:rPr>
@@ -15390,7 +15992,7 @@
               <w:sz w:val="22"/>
               <w:szCs w:val="22"/>
             </w:rPr>
-            <w:t>/</w:t>
+            <w:t/>
           </w:r>
           <w:r>
             <w:rPr>
@@ -15398,7 +16000,7 @@
               <w:sz w:val="22"/>
               <w:szCs w:val="22"/>
             </w:rPr>
-            <w:t>06</w:t>
+            <w:t/>
           </w:r>
           <w:r>
             <w:rPr>
@@ -15406,7 +16008,7 @@
               <w:sz w:val="22"/>
               <w:szCs w:val="22"/>
             </w:rPr>
-            <w:t>/2026</w:t>
+            <w:t/>
           </w:r>
         </w:p>
       </w:tc>
@@ -15877,6 +16479,26 @@
   <w:p>
     <w:pPr>
       <w:pStyle w:val="Encabezado"/>
+    </w:pPr>
+  </w:p>
+</w:hdr>
+</file>
+
+<file path=word/header2.xml><?xml version="1.0" encoding="utf-8"?>
+<w:hdr xmlns:m="http://schemas.openxmlformats.org/officeDocument/2006/math" xmlns:mc="http://schemas.openxmlformats.org/markup-compatibility/2006" xmlns:mo="http://schemas.microsoft.com/office/mac/office/2008/main" xmlns:mv="urn:schemas-microsoft-com:mac:vml" xmlns:o="urn:schemas-microsoft-com:office:office" xmlns:r="http://schemas.openxmlformats.org/officeDocument/2006/relationships" xmlns:v="urn:schemas-microsoft-com:vml" xmlns:w10="urn:schemas-microsoft-com:office:word" xmlns:w14="http://schemas.microsoft.com/office/word/2010/wordml" xmlns:w="http://schemas.openxmlformats.org/wordprocessingml/2006/main" xmlns:wne="http://schemas.microsoft.com/office/word/2006/wordml" xmlns:wp14="http://schemas.microsoft.com/office/word/2010/wordprocessingDrawing" xmlns:wp="http://schemas.openxmlformats.org/drawingml/2006/wordprocessingDrawing" xmlns:wpc="http://schemas.microsoft.com/office/word/2010/wordprocessingCanvas" xmlns:wpg="http://schemas.microsoft.com/office/word/2010/wordprocessingGroup" xmlns:wpi="http://schemas.microsoft.com/office/word/2010/wordprocessingInk" xmlns:wps="http://schemas.microsoft.com/office/word/2010/wordprocessingShape" mc:Ignorable="w14 wp14">
+  <w:p>
+    <w:pPr>
+      <w:pStyle w:val="Header"/>
+    </w:pPr>
+  </w:p>
+</w:hdr>
+</file>
+
+<file path=word/header3.xml><?xml version="1.0" encoding="utf-8"?>
+<w:hdr xmlns:m="http://schemas.openxmlformats.org/officeDocument/2006/math" xmlns:mc="http://schemas.openxmlformats.org/markup-compatibility/2006" xmlns:mo="http://schemas.microsoft.com/office/mac/office/2008/main" xmlns:mv="urn:schemas-microsoft-com:mac:vml" xmlns:o="urn:schemas-microsoft-com:office:office" xmlns:r="http://schemas.openxmlformats.org/officeDocument/2006/relationships" xmlns:v="urn:schemas-microsoft-com:vml" xmlns:w10="urn:schemas-microsoft-com:office:word" xmlns:w14="http://schemas.microsoft.com/office/word/2010/wordml" xmlns:w="http://schemas.openxmlformats.org/wordprocessingml/2006/main" xmlns:wne="http://schemas.microsoft.com/office/word/2006/wordml" xmlns:wp14="http://schemas.microsoft.com/office/word/2010/wordprocessingDrawing" xmlns:wp="http://schemas.openxmlformats.org/drawingml/2006/wordprocessingDrawing" xmlns:wpc="http://schemas.microsoft.com/office/word/2010/wordprocessingCanvas" xmlns:wpg="http://schemas.microsoft.com/office/word/2010/wordprocessingGroup" xmlns:wpi="http://schemas.microsoft.com/office/word/2010/wordprocessingInk" xmlns:wps="http://schemas.microsoft.com/office/word/2010/wordprocessingShape" mc:Ignorable="w14 wp14">
+  <w:p>
+    <w:pPr>
+      <w:pStyle w:val="Header"/>
     </w:pPr>
   </w:p>
 </w:hdr>

</xml_diff>